<commit_message>
added the articles that uers can now use
</commit_message>
<xml_diff>
--- a/UPGRADES NEEDED FOR CROP IQ.docx
+++ b/UPGRADES NEEDED FOR CROP IQ.docx
@@ -15,8 +15,6 @@
         </w:rPr>
         <w:t>UPGRADES NEEDED FOR CROP IQ</w:t>
       </w:r>
-      <w:bookmarkStart w:id="0" w:name="_GoBack"/>
-      <w:bookmarkEnd w:id="0"/>
       <w:r>
         <w:pict>
           <v:rect id="_x0000_i1025" o:spt="1" style="height:1.5pt;width:432pt;" fillcolor="#A0A0A0" filled="t" stroked="f" coordsize="21600,21600" o:hr="t" o:hrstd="t" o:hralign="center">
@@ -59,60 +57,8 @@
         <w:widowControl/>
         <w:suppressLineNumbers w:val="0"/>
       </w:pPr>
-      <w:r>
-        <w:rPr>
-          <w:rStyle w:val="6"/>
-        </w:rPr>
-        <w:t>Offline mode</w:t>
-      </w:r>
-      <w:r>
-        <w:t xml:space="preserve"> Zambian farmers often have poor connectivity. Cache the last weather data and crop recommendations locally using AsyncStorage so the app works without internet. This is probably the single most important improvement for your target users.</w:t>
-      </w:r>
-    </w:p>
-    <w:p>
-      <w:pPr>
-        <w:pStyle w:val="5"/>
-        <w:keepNext w:val="0"/>
-        <w:keepLines w:val="0"/>
-        <w:widowControl/>
-        <w:suppressLineNumbers w:val="0"/>
-      </w:pPr>
-      <w:r>
-        <w:rPr>
-          <w:rStyle w:val="6"/>
-        </w:rPr>
-        <w:t>Push notifications</w:t>
-      </w:r>
-      <w:r>
-        <w:t xml:space="preserve"> Alert farmers when it's the right time to plant based on the forecast signal. Something like "Rain expected in your area this week — good time to plant maize." This turns passive information into actionable advice.</w:t>
-      </w:r>
-    </w:p>
-    <w:p>
-      <w:pPr>
-        <w:pStyle w:val="5"/>
-        <w:keepNext w:val="0"/>
-        <w:keepLines w:val="0"/>
-        <w:widowControl/>
-        <w:suppressLineNumbers w:val="0"/>
-      </w:pPr>
-      <w:r>
-        <w:rPr>
-          <w:rStyle w:val="6"/>
-        </w:rPr>
-        <w:t>Market prices</w:t>
-      </w:r>
-      <w:r>
-        <w:t xml:space="preserve"> Add current crop market prices so farmers can decide not just what grows well but what's worth growing financially. Even a simple manually updated price list would be valuable.</w:t>
-      </w:r>
-    </w:p>
-    <w:p>
-      <w:pPr>
-        <w:pStyle w:val="5"/>
-        <w:keepNext w:val="0"/>
-        <w:keepLines w:val="0"/>
-        <w:widowControl/>
-        <w:suppressLineNumbers w:val="0"/>
-      </w:pPr>
+      <w:bookmarkStart w:id="0" w:name="_GoBack"/>
+      <w:bookmarkEnd w:id="0"/>
       <w:r>
         <w:rPr>
           <w:rStyle w:val="6"/>
@@ -1196,6 +1142,7 @@
       <w:jc w:val="left"/>
     </w:pPr>
     <w:rPr>
+      <w:rFonts w:ascii="Times New Roman" w:hAnsi="Times New Roman" w:eastAsia="SimSun" w:cs="Times New Roman"/>
       <w:kern w:val="0"/>
       <w:sz w:val="24"/>
       <w:szCs w:val="24"/>

</xml_diff>